<commit_message>
docs(paper): publish the synchronized robustness-pilot manuscript revisions
Update Discover Computing and IEEE DOCX/PDF editions with the exploratory
three-seed findings, measured threshold trade-offs and explicit limitations.
Preserve the title, original result tables, all 11 figures and 31 references.
No universal optimal threshold or completed Linux replication is claimed.

Validation: numerical and semantic publication checks pass. Visually inspect
all 31 journal pages and 22 IEEE pages, including the intact pilot table,
figure/caption pairing and repeated headers for continued tables. Preserve
539 prior evidence/production files unchanged.
</commit_message>
<xml_diff>
--- a/paper/Revon_Research_Paper_Discover_Computing.docx
+++ b/paper/Revon_Research_Paper_Discover_Computing.docx
@@ -128,7 +128,7 @@
         <w:jc w:val="both"/>
       </w:pPr>
       <w:r>
-        <w:t>Abstract: Revon is a Python prototype for durable, linear-history key/value versioning using a fixed-depth Merkle hash trie. Its hybrid variant chooses between changeset aggregation and hash-pruned comparison; trie geometry does not adapt. We make forced-Merkle Revon-M the primary ablation because both variants retain the same persistent representation and changesets. On eight synthetic workloads, five paired diff-latency intervals favour Revon-H and three include parity. A separate three-seed study also leaves the 50-commit result inconclusive. Public NYC TLC records extend evaluation to one million records with generated corrections; Revon-H has no consistent advantage when both variants choose Merkle comparison. A supplemental study tests five thresholds on disjoint calibration and validation workloads, with seven measured cached queries per configuration. Calibration selects 16,384 operations, while the original workflow results retain their frozen 4,096 threshold. No forced-path crossover appears through 32,768 operations in the main supplement; a separate long-history diagnostic investigates larger counts. Revon-H and Revon-M have nearly equal repository footprints, whereas both use more storage than Dolt in the measured workflows. All measurements use one physical computer, including WSL2. The evidence supports workload-dependent differencing choices, not general efficiency or production-system superiority.</w:t>
+        <w:t>Abstract: Revon is a Python prototype for durable, linear-history key/value versioning using a fixed-depth Merkle hash trie. Its hybrid variant chooses between changeset aggregation and hash-pruned comparison; trie geometry does not adapt. We make forced-Merkle Revon-M the primary ablation because both variants retain the same persistent representation and changesets. On eight synthetic workloads, five paired diff-latency intervals favour Revon-H and three include parity. A separate three-seed study also leaves the 50-commit result inconclusive. Public NYC TLC records extend evaluation to one million records with generated corrections; Revon-H has no consistent advantage when both variants choose Merkle comparison. A supplemental study tests five thresholds on disjoint calibration and validation workloads, with seven measured cached queries per configuration. Calibration selects 16,384 operations, while the original workflow results retain their frozen 4,096 threshold. No forced-path crossover appears through 32,768 operations in the main supplement; separate exploratory diagnostics investigate larger counts. A three-seed pilot finds different preferred paths at the same operation count across two workload profiles. Revon-H and Revon-M have nearly equal repository footprints, whereas both use more storage than Dolt in the measured workflows. All measurements use one physical computer, including WSL2. The evidence supports workload-dependent differencing choices, not general efficiency or production-system superiority.</w:t>
       </w:r>
     </w:p>
     <w:p>
@@ -2522,6 +2522,107 @@
                 <w:b w:val="0"/>
                 <w:sz w:val="24"/>
               </w:rPr>
+              <w:t>Threshold robustness pilot</w:t>
+            </w:r>
+          </w:p>
+        </w:tc>
+        <w:tc>
+          <w:tcPr>
+            <w:tcW w:type="dxa" w:w="3894"/>
+            <w:tcBorders>
+              <w:top w:val="single" w:sz="4" w:color="D9D9D9"/>
+              <w:bottom w:val="single" w:sz="4" w:color="D9D9D9"/>
+              <w:left w:val="single" w:sz="4" w:color="D9D9D9"/>
+              <w:right w:val="single" w:sz="4" w:color="D9D9D9"/>
+            </w:tcBorders>
+            <w:tcMar>
+              <w:top w:w="60" w:type="dxa"/>
+              <w:bottom w:w="60" w:type="dxa"/>
+              <w:left w:w="60" w:type="dxa"/>
+              <w:right w:w="60" w:type="dxa"/>
+            </w:tcMar>
+          </w:tcPr>
+          <w:p>
+            <w:pPr>
+              <w:keepNext/>
+              <w:widowControl/>
+              <w:spacing w:after="60" w:before="40" w:line="250" w:lineRule="auto"/>
+            </w:pPr>
+            <w:r>
+              <w:rPr>
+                <w:rFonts w:ascii="Arial" w:hAnsi="Arial" w:eastAsia="Arial" w:cs="Arial"/>
+                <w:b w:val="0"/>
+                <w:sz w:val="24"/>
+              </w:rPr>
+              <w:t>Same Windows host; Python 3.14.3; psutil 7.1.0; three new seeds</w:t>
+            </w:r>
+          </w:p>
+        </w:tc>
+        <w:tc>
+          <w:tcPr>
+            <w:tcW w:type="dxa" w:w="3894"/>
+            <w:tcBorders>
+              <w:top w:val="single" w:sz="4" w:color="D9D9D9"/>
+              <w:bottom w:val="single" w:sz="4" w:color="D9D9D9"/>
+              <w:left w:val="single" w:sz="4" w:color="D9D9D9"/>
+              <w:right w:val="single" w:sz="4" w:color="D9D9D9"/>
+            </w:tcBorders>
+            <w:tcMar>
+              <w:top w:w="60" w:type="dxa"/>
+              <w:bottom w:w="60" w:type="dxa"/>
+              <w:left w:w="60" w:type="dxa"/>
+              <w:right w:w="60" w:type="dxa"/>
+            </w:tcMar>
+          </w:tcPr>
+          <w:p>
+            <w:pPr>
+              <w:keepNext/>
+              <w:widowControl/>
+              <w:spacing w:after="60" w:before="40" w:line="250" w:lineRule="auto"/>
+            </w:pPr>
+            <w:r>
+              <w:rPr>
+                <w:rFonts w:ascii="Arial" w:hAnsi="Arial" w:eastAsia="Arial" w:cs="Arial"/>
+                <w:b w:val="0"/>
+                <w:sz w:val="24"/>
+              </w:rPr>
+              <w:t>12 repositories; 714 queries, including 546 measured; exploratory, separate from held-out selection</w:t>
+            </w:r>
+          </w:p>
+        </w:tc>
+      </w:tr>
+      <w:tr>
+        <w:trPr>
+          <w:cantSplit/>
+        </w:trPr>
+        <w:tc>
+          <w:tcPr>
+            <w:tcW w:type="dxa" w:w="1947"/>
+            <w:tcBorders>
+              <w:top w:val="single" w:sz="4" w:color="D9D9D9"/>
+              <w:bottom w:val="single" w:sz="4" w:color="D9D9D9"/>
+              <w:left w:val="single" w:sz="4" w:color="D9D9D9"/>
+              <w:right w:val="single" w:sz="4" w:color="D9D9D9"/>
+            </w:tcBorders>
+            <w:tcMar>
+              <w:top w:w="60" w:type="dxa"/>
+              <w:bottom w:w="60" w:type="dxa"/>
+              <w:left w:w="60" w:type="dxa"/>
+              <w:right w:w="60" w:type="dxa"/>
+            </w:tcMar>
+          </w:tcPr>
+          <w:p>
+            <w:pPr>
+              <w:keepNext/>
+              <w:widowControl/>
+              <w:spacing w:after="60" w:before="40" w:line="250" w:lineRule="auto"/>
+            </w:pPr>
+            <w:r>
+              <w:rPr>
+                <w:rFonts w:ascii="Arial" w:hAnsi="Arial" w:eastAsia="Arial" w:cs="Arial"/>
+                <w:b w:val="0"/>
+                <w:sz w:val="24"/>
+              </w:rPr>
               <w:t>Physical host</w:t>
             </w:r>
           </w:p>
@@ -6136,6 +6237,42 @@
       </w:pPr>
       <w:r>
         <w:t>The diagnostic median log/Merkle ratios are 0.44 at 8,192, 0.55 at 16,384, 1.11 at 32,768, 0.92 at 65,536, 1.40 at 131,072 operations. Merkle first has the lower sampled median at 32,768, log is lower again at 65,536, and Merkle is lower at 131,072. This non-monotonic ordering is not a resolved single crossover or an optimal switching rule; IQRs and raw queries are retained, and only one seed was used.</w:t>
+      </w:r>
+    </w:p>
+    <w:p>
+      <w:pPr>
+        <w:pStyle w:val="Heading2"/>
+        <w:widowControl/>
+      </w:pPr>
+      <w:r>
+        <w:t>Exploratory threshold robustness pilot</w:t>
+      </w:r>
+    </w:p>
+    <w:p>
+      <w:pPr>
+        <w:widowControl/>
+        <w:jc w:val="both"/>
+      </w:pPr>
+      <w:r>
+        <w:t>A separate pilot freezes thresholds 4,096, 16,384, 32,768, 65,536 and 131,072, with forced log (always-log) and forced Merkle baselines. Three new seeds, 20261021-20261023, generate independent histories for each condition. Profiles are 10k rows/256 commits/repeated-key and 100k rows/64 commits/spread, sampled at 32,768, 65,536 and 131,072 operations. A predeclared wall-time rule reduces the initial 18 cases to all nine repeated-key cases and three spread cases at 65,536, before latency trends are inspected. Six spread cases at the other counts are not run; no failed or unfavourable result is discarded. The retained 12 repositories take 28.3 minutes and reach 1,214 MiB sampled worker RSS.</w:t>
+      </w:r>
+    </w:p>
+    <w:p>
+      <w:pPr>
+        <w:widowControl/>
+        <w:jc w:val="both"/>
+      </w:pPr>
+      <w:r>
+        <w:t>Each repository uses two warm-up and five measured randomized query blocks for seven configurations. Both profiles at 65,536 also use three blocks with a separate reopened process for each configuration. The 588 warmed queries include 420 measured queries; all 126 fresh-process queries are measured. All 714 timed queries match the common canonical semantic oracle, and reverse/identity, representative checkout, persistent-integrity and reopen checks pass. Timers include semantic output materialization; separate decision probes are not subtracted. Each commit has one insert and one delete, with the remaining mutations being updates. Actual distinct keys, output sizes, work counters and mutation counts are retained. Query repeats are nested within three independent histories per condition; no population confidence interval is claimed.</w:t>
+      </w:r>
+    </w:p>
+    <w:p>
+      <w:pPr>
+        <w:widowControl/>
+        <w:jc w:val="both"/>
+      </w:pPr>
+      <w:r>
+        <w:t>Reopening eagerly loads and verifies the persistent object model before diff timing; open latency is separate and the OS filesystem cache is not cleared. Warmed workers use the workload seed as Python hash seed, while fresh workers use workload seed plus block. Both paths share a hash seed within each fresh block, but warmed/fresh comparisons do not isolate caching alone. This pilot neither recalibrates T nor reuses held-out results to select a new threshold. Its five warmed and three fresh query blocks differ from the earlier protocols; the bundles remain separate.</w:t>
       </w:r>
     </w:p>
     <w:p>
@@ -16589,6 +16726,897 @@
     </w:p>
     <w:p>
       <w:pPr>
+        <w:pStyle w:val="Heading2"/>
+        <w:widowControl/>
+      </w:pPr>
+      <w:r>
+        <w:t>Exploratory pilot results</w:t>
+      </w:r>
+    </w:p>
+    <w:p>
+      <w:pPr>
+        <w:widowControl/>
+        <w:jc w:val="both"/>
+      </w:pPr>
+      <w:r>
+        <w:t>Table 11 reports all three seed-specific forced-path ratios for each retained warmed pilot condition.</w:t>
+      </w:r>
+    </w:p>
+    <w:p>
+      <w:pPr>
+        <w:pStyle w:val="Caption"/>
+        <w:keepNext/>
+        <w:jc w:val="left"/>
+      </w:pPr>
+      <w:r>
+        <w:t>Table 11 Exploratory pilot log/Merkle ratios of warmed-query medians; below one favours log. Seed suffixes 21-23 denote 20261021-20261023</w:t>
+      </w:r>
+    </w:p>
+    <w:tbl>
+      <w:tblPr>
+        <w:tblW w:type="auto" w:w="0"/>
+        <w:tblLayout w:type="fixed"/>
+        <w:tblLook w:firstColumn="1" w:firstRow="1" w:lastColumn="0" w:lastRow="0" w:noHBand="0" w:noVBand="1" w:val="04A0"/>
+      </w:tblPr>
+      <w:tblGrid>
+        <w:gridCol w:w="3699"/>
+        <w:gridCol w:w="1655"/>
+        <w:gridCol w:w="1460"/>
+        <w:gridCol w:w="1460"/>
+        <w:gridCol w:w="1460"/>
+      </w:tblGrid>
+      <w:tr>
+        <w:trPr>
+          <w:cantSplit/>
+          <w:tblHeader/>
+        </w:trPr>
+        <w:tc>
+          <w:tcPr>
+            <w:tcW w:type="dxa" w:w="3699"/>
+            <w:tcBorders>
+              <w:top w:val="single" w:sz="4" w:color="D9D9D9"/>
+              <w:bottom w:val="single" w:sz="4" w:color="D9D9D9"/>
+              <w:left w:val="single" w:sz="4" w:color="D9D9D9"/>
+              <w:right w:val="single" w:sz="4" w:color="D9D9D9"/>
+            </w:tcBorders>
+            <w:shd w:fill="E8EDF1"/>
+            <w:tcMar>
+              <w:top w:w="60" w:type="dxa"/>
+              <w:bottom w:w="60" w:type="dxa"/>
+              <w:left w:w="60" w:type="dxa"/>
+              <w:right w:w="60" w:type="dxa"/>
+            </w:tcMar>
+          </w:tcPr>
+          <w:p>
+            <w:pPr>
+              <w:keepNext/>
+              <w:widowControl/>
+              <w:spacing w:after="60" w:before="40" w:line="250" w:lineRule="auto"/>
+            </w:pPr>
+            <w:r>
+              <w:rPr>
+                <w:rFonts w:ascii="Arial" w:hAnsi="Arial" w:eastAsia="Arial" w:cs="Arial"/>
+                <w:b/>
+                <w:sz w:val="24"/>
+              </w:rPr>
+              <w:t>Rows / history / locality</w:t>
+            </w:r>
+          </w:p>
+        </w:tc>
+        <w:tc>
+          <w:tcPr>
+            <w:tcW w:type="dxa" w:w="1655"/>
+            <w:tcBorders>
+              <w:top w:val="single" w:sz="4" w:color="D9D9D9"/>
+              <w:bottom w:val="single" w:sz="4" w:color="D9D9D9"/>
+              <w:left w:val="single" w:sz="4" w:color="D9D9D9"/>
+              <w:right w:val="single" w:sz="4" w:color="D9D9D9"/>
+            </w:tcBorders>
+            <w:shd w:fill="E8EDF1"/>
+            <w:tcMar>
+              <w:top w:w="60" w:type="dxa"/>
+              <w:bottom w:w="60" w:type="dxa"/>
+              <w:left w:w="60" w:type="dxa"/>
+              <w:right w:w="60" w:type="dxa"/>
+            </w:tcMar>
+          </w:tcPr>
+          <w:p>
+            <w:pPr>
+              <w:keepNext/>
+              <w:widowControl/>
+              <w:spacing w:after="60" w:before="40" w:line="250" w:lineRule="auto"/>
+            </w:pPr>
+            <w:r>
+              <w:rPr>
+                <w:rFonts w:ascii="Arial" w:hAnsi="Arial" w:eastAsia="Arial" w:cs="Arial"/>
+                <w:b/>
+                <w:sz w:val="24"/>
+              </w:rPr>
+              <w:t>Operations</w:t>
+            </w:r>
+          </w:p>
+        </w:tc>
+        <w:tc>
+          <w:tcPr>
+            <w:tcW w:type="dxa" w:w="1460"/>
+            <w:tcBorders>
+              <w:top w:val="single" w:sz="4" w:color="D9D9D9"/>
+              <w:bottom w:val="single" w:sz="4" w:color="D9D9D9"/>
+              <w:left w:val="single" w:sz="4" w:color="D9D9D9"/>
+              <w:right w:val="single" w:sz="4" w:color="D9D9D9"/>
+            </w:tcBorders>
+            <w:shd w:fill="E8EDF1"/>
+            <w:tcMar>
+              <w:top w:w="60" w:type="dxa"/>
+              <w:bottom w:w="60" w:type="dxa"/>
+              <w:left w:w="60" w:type="dxa"/>
+              <w:right w:w="60" w:type="dxa"/>
+            </w:tcMar>
+          </w:tcPr>
+          <w:p>
+            <w:pPr>
+              <w:keepNext/>
+              <w:widowControl/>
+              <w:spacing w:after="60" w:before="40" w:line="250" w:lineRule="auto"/>
+            </w:pPr>
+            <w:r>
+              <w:rPr>
+                <w:rFonts w:ascii="Arial" w:hAnsi="Arial" w:eastAsia="Arial" w:cs="Arial"/>
+                <w:b/>
+                <w:sz w:val="24"/>
+              </w:rPr>
+              <w:t>Seed 21</w:t>
+            </w:r>
+          </w:p>
+        </w:tc>
+        <w:tc>
+          <w:tcPr>
+            <w:tcW w:type="dxa" w:w="1460"/>
+            <w:tcBorders>
+              <w:top w:val="single" w:sz="4" w:color="D9D9D9"/>
+              <w:bottom w:val="single" w:sz="4" w:color="D9D9D9"/>
+              <w:left w:val="single" w:sz="4" w:color="D9D9D9"/>
+              <w:right w:val="single" w:sz="4" w:color="D9D9D9"/>
+            </w:tcBorders>
+            <w:shd w:fill="E8EDF1"/>
+            <w:tcMar>
+              <w:top w:w="60" w:type="dxa"/>
+              <w:bottom w:w="60" w:type="dxa"/>
+              <w:left w:w="60" w:type="dxa"/>
+              <w:right w:w="60" w:type="dxa"/>
+            </w:tcMar>
+          </w:tcPr>
+          <w:p>
+            <w:pPr>
+              <w:keepNext/>
+              <w:widowControl/>
+              <w:spacing w:after="60" w:before="40" w:line="250" w:lineRule="auto"/>
+            </w:pPr>
+            <w:r>
+              <w:rPr>
+                <w:rFonts w:ascii="Arial" w:hAnsi="Arial" w:eastAsia="Arial" w:cs="Arial"/>
+                <w:b/>
+                <w:sz w:val="24"/>
+              </w:rPr>
+              <w:t>Seed 22</w:t>
+            </w:r>
+          </w:p>
+        </w:tc>
+        <w:tc>
+          <w:tcPr>
+            <w:tcW w:type="dxa" w:w="1460"/>
+            <w:tcBorders>
+              <w:top w:val="single" w:sz="4" w:color="D9D9D9"/>
+              <w:bottom w:val="single" w:sz="4" w:color="D9D9D9"/>
+              <w:left w:val="single" w:sz="4" w:color="D9D9D9"/>
+              <w:right w:val="single" w:sz="4" w:color="D9D9D9"/>
+            </w:tcBorders>
+            <w:shd w:fill="E8EDF1"/>
+            <w:tcMar>
+              <w:top w:w="60" w:type="dxa"/>
+              <w:bottom w:w="60" w:type="dxa"/>
+              <w:left w:w="60" w:type="dxa"/>
+              <w:right w:w="60" w:type="dxa"/>
+            </w:tcMar>
+          </w:tcPr>
+          <w:p>
+            <w:pPr>
+              <w:keepNext/>
+              <w:widowControl/>
+              <w:spacing w:after="60" w:before="40" w:line="250" w:lineRule="auto"/>
+            </w:pPr>
+            <w:r>
+              <w:rPr>
+                <w:rFonts w:ascii="Arial" w:hAnsi="Arial" w:eastAsia="Arial" w:cs="Arial"/>
+                <w:b/>
+                <w:sz w:val="24"/>
+              </w:rPr>
+              <w:t>Seed 23</w:t>
+            </w:r>
+          </w:p>
+        </w:tc>
+      </w:tr>
+      <w:tr>
+        <w:trPr>
+          <w:cantSplit/>
+        </w:trPr>
+        <w:tc>
+          <w:tcPr>
+            <w:tcW w:type="dxa" w:w="3699"/>
+            <w:tcBorders>
+              <w:top w:val="single" w:sz="4" w:color="D9D9D9"/>
+              <w:bottom w:val="single" w:sz="4" w:color="D9D9D9"/>
+              <w:left w:val="single" w:sz="4" w:color="D9D9D9"/>
+              <w:right w:val="single" w:sz="4" w:color="D9D9D9"/>
+            </w:tcBorders>
+            <w:tcMar>
+              <w:top w:w="60" w:type="dxa"/>
+              <w:bottom w:w="60" w:type="dxa"/>
+              <w:left w:w="60" w:type="dxa"/>
+              <w:right w:w="60" w:type="dxa"/>
+            </w:tcMar>
+          </w:tcPr>
+          <w:p>
+            <w:pPr>
+              <w:keepNext/>
+              <w:widowControl/>
+              <w:spacing w:after="60" w:before="40" w:line="250" w:lineRule="auto"/>
+            </w:pPr>
+            <w:r>
+              <w:rPr>
+                <w:rFonts w:ascii="Arial" w:hAnsi="Arial" w:eastAsia="Arial" w:cs="Arial"/>
+                <w:b w:val="0"/>
+                <w:sz w:val="24"/>
+              </w:rPr>
+              <w:t>10k / H256 / repeated-key</w:t>
+            </w:r>
+          </w:p>
+        </w:tc>
+        <w:tc>
+          <w:tcPr>
+            <w:tcW w:type="dxa" w:w="1655"/>
+            <w:tcBorders>
+              <w:top w:val="single" w:sz="4" w:color="D9D9D9"/>
+              <w:bottom w:val="single" w:sz="4" w:color="D9D9D9"/>
+              <w:left w:val="single" w:sz="4" w:color="D9D9D9"/>
+              <w:right w:val="single" w:sz="4" w:color="D9D9D9"/>
+            </w:tcBorders>
+            <w:tcMar>
+              <w:top w:w="60" w:type="dxa"/>
+              <w:bottom w:w="60" w:type="dxa"/>
+              <w:left w:w="60" w:type="dxa"/>
+              <w:right w:w="60" w:type="dxa"/>
+            </w:tcMar>
+          </w:tcPr>
+          <w:p>
+            <w:pPr>
+              <w:keepNext/>
+              <w:widowControl/>
+              <w:spacing w:after="60" w:before="40" w:line="250" w:lineRule="auto"/>
+            </w:pPr>
+            <w:r>
+              <w:rPr>
+                <w:rFonts w:ascii="Arial" w:hAnsi="Arial" w:eastAsia="Arial" w:cs="Arial"/>
+                <w:b w:val="0"/>
+                <w:sz w:val="24"/>
+              </w:rPr>
+              <w:t>32,768</w:t>
+            </w:r>
+          </w:p>
+        </w:tc>
+        <w:tc>
+          <w:tcPr>
+            <w:tcW w:type="dxa" w:w="1460"/>
+            <w:tcBorders>
+              <w:top w:val="single" w:sz="4" w:color="D9D9D9"/>
+              <w:bottom w:val="single" w:sz="4" w:color="D9D9D9"/>
+              <w:left w:val="single" w:sz="4" w:color="D9D9D9"/>
+              <w:right w:val="single" w:sz="4" w:color="D9D9D9"/>
+            </w:tcBorders>
+            <w:tcMar>
+              <w:top w:w="60" w:type="dxa"/>
+              <w:bottom w:w="60" w:type="dxa"/>
+              <w:left w:w="60" w:type="dxa"/>
+              <w:right w:w="60" w:type="dxa"/>
+            </w:tcMar>
+          </w:tcPr>
+          <w:p>
+            <w:pPr>
+              <w:keepNext/>
+              <w:widowControl/>
+              <w:spacing w:after="60" w:before="40" w:line="250" w:lineRule="auto"/>
+            </w:pPr>
+            <w:r>
+              <w:rPr>
+                <w:rFonts w:ascii="Arial" w:hAnsi="Arial" w:eastAsia="Arial" w:cs="Arial"/>
+                <w:b w:val="0"/>
+                <w:sz w:val="24"/>
+              </w:rPr>
+              <w:t>0.817</w:t>
+            </w:r>
+          </w:p>
+        </w:tc>
+        <w:tc>
+          <w:tcPr>
+            <w:tcW w:type="dxa" w:w="1460"/>
+            <w:tcBorders>
+              <w:top w:val="single" w:sz="4" w:color="D9D9D9"/>
+              <w:bottom w:val="single" w:sz="4" w:color="D9D9D9"/>
+              <w:left w:val="single" w:sz="4" w:color="D9D9D9"/>
+              <w:right w:val="single" w:sz="4" w:color="D9D9D9"/>
+            </w:tcBorders>
+            <w:tcMar>
+              <w:top w:w="60" w:type="dxa"/>
+              <w:bottom w:w="60" w:type="dxa"/>
+              <w:left w:w="60" w:type="dxa"/>
+              <w:right w:w="60" w:type="dxa"/>
+            </w:tcMar>
+          </w:tcPr>
+          <w:p>
+            <w:pPr>
+              <w:keepNext/>
+              <w:widowControl/>
+              <w:spacing w:after="60" w:before="40" w:line="250" w:lineRule="auto"/>
+            </w:pPr>
+            <w:r>
+              <w:rPr>
+                <w:rFonts w:ascii="Arial" w:hAnsi="Arial" w:eastAsia="Arial" w:cs="Arial"/>
+                <w:b w:val="0"/>
+                <w:sz w:val="24"/>
+              </w:rPr>
+              <w:t>0.806</w:t>
+            </w:r>
+          </w:p>
+        </w:tc>
+        <w:tc>
+          <w:tcPr>
+            <w:tcW w:type="dxa" w:w="1460"/>
+            <w:tcBorders>
+              <w:top w:val="single" w:sz="4" w:color="D9D9D9"/>
+              <w:bottom w:val="single" w:sz="4" w:color="D9D9D9"/>
+              <w:left w:val="single" w:sz="4" w:color="D9D9D9"/>
+              <w:right w:val="single" w:sz="4" w:color="D9D9D9"/>
+            </w:tcBorders>
+            <w:tcMar>
+              <w:top w:w="60" w:type="dxa"/>
+              <w:bottom w:w="60" w:type="dxa"/>
+              <w:left w:w="60" w:type="dxa"/>
+              <w:right w:w="60" w:type="dxa"/>
+            </w:tcMar>
+          </w:tcPr>
+          <w:p>
+            <w:pPr>
+              <w:keepNext/>
+              <w:widowControl/>
+              <w:spacing w:after="60" w:before="40" w:line="250" w:lineRule="auto"/>
+            </w:pPr>
+            <w:r>
+              <w:rPr>
+                <w:rFonts w:ascii="Arial" w:hAnsi="Arial" w:eastAsia="Arial" w:cs="Arial"/>
+                <w:b w:val="0"/>
+                <w:sz w:val="24"/>
+              </w:rPr>
+              <w:t>0.738</w:t>
+            </w:r>
+          </w:p>
+        </w:tc>
+      </w:tr>
+      <w:tr>
+        <w:trPr>
+          <w:cantSplit/>
+        </w:trPr>
+        <w:tc>
+          <w:tcPr>
+            <w:tcW w:type="dxa" w:w="3699"/>
+            <w:tcBorders>
+              <w:top w:val="single" w:sz="4" w:color="D9D9D9"/>
+              <w:bottom w:val="single" w:sz="4" w:color="D9D9D9"/>
+              <w:left w:val="single" w:sz="4" w:color="D9D9D9"/>
+              <w:right w:val="single" w:sz="4" w:color="D9D9D9"/>
+            </w:tcBorders>
+            <w:tcMar>
+              <w:top w:w="60" w:type="dxa"/>
+              <w:bottom w:w="60" w:type="dxa"/>
+              <w:left w:w="60" w:type="dxa"/>
+              <w:right w:w="60" w:type="dxa"/>
+            </w:tcMar>
+          </w:tcPr>
+          <w:p>
+            <w:pPr>
+              <w:keepNext/>
+              <w:widowControl/>
+              <w:spacing w:after="60" w:before="40" w:line="250" w:lineRule="auto"/>
+            </w:pPr>
+            <w:r>
+              <w:rPr>
+                <w:rFonts w:ascii="Arial" w:hAnsi="Arial" w:eastAsia="Arial" w:cs="Arial"/>
+                <w:b w:val="0"/>
+                <w:sz w:val="24"/>
+              </w:rPr>
+              <w:t>10k / H256 / repeated-key</w:t>
+            </w:r>
+          </w:p>
+        </w:tc>
+        <w:tc>
+          <w:tcPr>
+            <w:tcW w:type="dxa" w:w="1655"/>
+            <w:tcBorders>
+              <w:top w:val="single" w:sz="4" w:color="D9D9D9"/>
+              <w:bottom w:val="single" w:sz="4" w:color="D9D9D9"/>
+              <w:left w:val="single" w:sz="4" w:color="D9D9D9"/>
+              <w:right w:val="single" w:sz="4" w:color="D9D9D9"/>
+            </w:tcBorders>
+            <w:tcMar>
+              <w:top w:w="60" w:type="dxa"/>
+              <w:bottom w:w="60" w:type="dxa"/>
+              <w:left w:w="60" w:type="dxa"/>
+              <w:right w:w="60" w:type="dxa"/>
+            </w:tcMar>
+          </w:tcPr>
+          <w:p>
+            <w:pPr>
+              <w:keepNext/>
+              <w:widowControl/>
+              <w:spacing w:after="60" w:before="40" w:line="250" w:lineRule="auto"/>
+            </w:pPr>
+            <w:r>
+              <w:rPr>
+                <w:rFonts w:ascii="Arial" w:hAnsi="Arial" w:eastAsia="Arial" w:cs="Arial"/>
+                <w:b w:val="0"/>
+                <w:sz w:val="24"/>
+              </w:rPr>
+              <w:t>65,536</w:t>
+            </w:r>
+          </w:p>
+        </w:tc>
+        <w:tc>
+          <w:tcPr>
+            <w:tcW w:type="dxa" w:w="1460"/>
+            <w:tcBorders>
+              <w:top w:val="single" w:sz="4" w:color="D9D9D9"/>
+              <w:bottom w:val="single" w:sz="4" w:color="D9D9D9"/>
+              <w:left w:val="single" w:sz="4" w:color="D9D9D9"/>
+              <w:right w:val="single" w:sz="4" w:color="D9D9D9"/>
+            </w:tcBorders>
+            <w:tcMar>
+              <w:top w:w="60" w:type="dxa"/>
+              <w:bottom w:w="60" w:type="dxa"/>
+              <w:left w:w="60" w:type="dxa"/>
+              <w:right w:w="60" w:type="dxa"/>
+            </w:tcMar>
+          </w:tcPr>
+          <w:p>
+            <w:pPr>
+              <w:keepNext/>
+              <w:widowControl/>
+              <w:spacing w:after="60" w:before="40" w:line="250" w:lineRule="auto"/>
+            </w:pPr>
+            <w:r>
+              <w:rPr>
+                <w:rFonts w:ascii="Arial" w:hAnsi="Arial" w:eastAsia="Arial" w:cs="Arial"/>
+                <w:b w:val="0"/>
+                <w:sz w:val="24"/>
+              </w:rPr>
+              <w:t>1.167</w:t>
+            </w:r>
+          </w:p>
+        </w:tc>
+        <w:tc>
+          <w:tcPr>
+            <w:tcW w:type="dxa" w:w="1460"/>
+            <w:tcBorders>
+              <w:top w:val="single" w:sz="4" w:color="D9D9D9"/>
+              <w:bottom w:val="single" w:sz="4" w:color="D9D9D9"/>
+              <w:left w:val="single" w:sz="4" w:color="D9D9D9"/>
+              <w:right w:val="single" w:sz="4" w:color="D9D9D9"/>
+            </w:tcBorders>
+            <w:tcMar>
+              <w:top w:w="60" w:type="dxa"/>
+              <w:bottom w:w="60" w:type="dxa"/>
+              <w:left w:w="60" w:type="dxa"/>
+              <w:right w:w="60" w:type="dxa"/>
+            </w:tcMar>
+          </w:tcPr>
+          <w:p>
+            <w:pPr>
+              <w:keepNext/>
+              <w:widowControl/>
+              <w:spacing w:after="60" w:before="40" w:line="250" w:lineRule="auto"/>
+            </w:pPr>
+            <w:r>
+              <w:rPr>
+                <w:rFonts w:ascii="Arial" w:hAnsi="Arial" w:eastAsia="Arial" w:cs="Arial"/>
+                <w:b w:val="0"/>
+                <w:sz w:val="24"/>
+              </w:rPr>
+              <w:t>1.197</w:t>
+            </w:r>
+          </w:p>
+        </w:tc>
+        <w:tc>
+          <w:tcPr>
+            <w:tcW w:type="dxa" w:w="1460"/>
+            <w:tcBorders>
+              <w:top w:val="single" w:sz="4" w:color="D9D9D9"/>
+              <w:bottom w:val="single" w:sz="4" w:color="D9D9D9"/>
+              <w:left w:val="single" w:sz="4" w:color="D9D9D9"/>
+              <w:right w:val="single" w:sz="4" w:color="D9D9D9"/>
+            </w:tcBorders>
+            <w:tcMar>
+              <w:top w:w="60" w:type="dxa"/>
+              <w:bottom w:w="60" w:type="dxa"/>
+              <w:left w:w="60" w:type="dxa"/>
+              <w:right w:w="60" w:type="dxa"/>
+            </w:tcMar>
+          </w:tcPr>
+          <w:p>
+            <w:pPr>
+              <w:keepNext/>
+              <w:widowControl/>
+              <w:spacing w:after="60" w:before="40" w:line="250" w:lineRule="auto"/>
+            </w:pPr>
+            <w:r>
+              <w:rPr>
+                <w:rFonts w:ascii="Arial" w:hAnsi="Arial" w:eastAsia="Arial" w:cs="Arial"/>
+                <w:b w:val="0"/>
+                <w:sz w:val="24"/>
+              </w:rPr>
+              <w:t>1.174</w:t>
+            </w:r>
+          </w:p>
+        </w:tc>
+      </w:tr>
+      <w:tr>
+        <w:trPr>
+          <w:cantSplit/>
+        </w:trPr>
+        <w:tc>
+          <w:tcPr>
+            <w:tcW w:type="dxa" w:w="3699"/>
+            <w:tcBorders>
+              <w:top w:val="single" w:sz="4" w:color="D9D9D9"/>
+              <w:bottom w:val="single" w:sz="4" w:color="D9D9D9"/>
+              <w:left w:val="single" w:sz="4" w:color="D9D9D9"/>
+              <w:right w:val="single" w:sz="4" w:color="D9D9D9"/>
+            </w:tcBorders>
+            <w:tcMar>
+              <w:top w:w="60" w:type="dxa"/>
+              <w:bottom w:w="60" w:type="dxa"/>
+              <w:left w:w="60" w:type="dxa"/>
+              <w:right w:w="60" w:type="dxa"/>
+            </w:tcMar>
+          </w:tcPr>
+          <w:p>
+            <w:pPr>
+              <w:keepNext/>
+              <w:widowControl/>
+              <w:spacing w:after="60" w:before="40" w:line="250" w:lineRule="auto"/>
+            </w:pPr>
+            <w:r>
+              <w:rPr>
+                <w:rFonts w:ascii="Arial" w:hAnsi="Arial" w:eastAsia="Arial" w:cs="Arial"/>
+                <w:b w:val="0"/>
+                <w:sz w:val="24"/>
+              </w:rPr>
+              <w:t>10k / H256 / repeated-key</w:t>
+            </w:r>
+          </w:p>
+        </w:tc>
+        <w:tc>
+          <w:tcPr>
+            <w:tcW w:type="dxa" w:w="1655"/>
+            <w:tcBorders>
+              <w:top w:val="single" w:sz="4" w:color="D9D9D9"/>
+              <w:bottom w:val="single" w:sz="4" w:color="D9D9D9"/>
+              <w:left w:val="single" w:sz="4" w:color="D9D9D9"/>
+              <w:right w:val="single" w:sz="4" w:color="D9D9D9"/>
+            </w:tcBorders>
+            <w:tcMar>
+              <w:top w:w="60" w:type="dxa"/>
+              <w:bottom w:w="60" w:type="dxa"/>
+              <w:left w:w="60" w:type="dxa"/>
+              <w:right w:w="60" w:type="dxa"/>
+            </w:tcMar>
+          </w:tcPr>
+          <w:p>
+            <w:pPr>
+              <w:keepNext/>
+              <w:widowControl/>
+              <w:spacing w:after="60" w:before="40" w:line="250" w:lineRule="auto"/>
+            </w:pPr>
+            <w:r>
+              <w:rPr>
+                <w:rFonts w:ascii="Arial" w:hAnsi="Arial" w:eastAsia="Arial" w:cs="Arial"/>
+                <w:b w:val="0"/>
+                <w:sz w:val="24"/>
+              </w:rPr>
+              <w:t>131,072</w:t>
+            </w:r>
+          </w:p>
+        </w:tc>
+        <w:tc>
+          <w:tcPr>
+            <w:tcW w:type="dxa" w:w="1460"/>
+            <w:tcBorders>
+              <w:top w:val="single" w:sz="4" w:color="D9D9D9"/>
+              <w:bottom w:val="single" w:sz="4" w:color="D9D9D9"/>
+              <w:left w:val="single" w:sz="4" w:color="D9D9D9"/>
+              <w:right w:val="single" w:sz="4" w:color="D9D9D9"/>
+            </w:tcBorders>
+            <w:tcMar>
+              <w:top w:w="60" w:type="dxa"/>
+              <w:bottom w:w="60" w:type="dxa"/>
+              <w:left w:w="60" w:type="dxa"/>
+              <w:right w:w="60" w:type="dxa"/>
+            </w:tcMar>
+          </w:tcPr>
+          <w:p>
+            <w:pPr>
+              <w:keepNext/>
+              <w:widowControl/>
+              <w:spacing w:after="60" w:before="40" w:line="250" w:lineRule="auto"/>
+            </w:pPr>
+            <w:r>
+              <w:rPr>
+                <w:rFonts w:ascii="Arial" w:hAnsi="Arial" w:eastAsia="Arial" w:cs="Arial"/>
+                <w:b w:val="0"/>
+                <w:sz w:val="24"/>
+              </w:rPr>
+              <w:t>1.507</w:t>
+            </w:r>
+          </w:p>
+        </w:tc>
+        <w:tc>
+          <w:tcPr>
+            <w:tcW w:type="dxa" w:w="1460"/>
+            <w:tcBorders>
+              <w:top w:val="single" w:sz="4" w:color="D9D9D9"/>
+              <w:bottom w:val="single" w:sz="4" w:color="D9D9D9"/>
+              <w:left w:val="single" w:sz="4" w:color="D9D9D9"/>
+              <w:right w:val="single" w:sz="4" w:color="D9D9D9"/>
+            </w:tcBorders>
+            <w:tcMar>
+              <w:top w:w="60" w:type="dxa"/>
+              <w:bottom w:w="60" w:type="dxa"/>
+              <w:left w:w="60" w:type="dxa"/>
+              <w:right w:w="60" w:type="dxa"/>
+            </w:tcMar>
+          </w:tcPr>
+          <w:p>
+            <w:pPr>
+              <w:keepNext/>
+              <w:widowControl/>
+              <w:spacing w:after="60" w:before="40" w:line="250" w:lineRule="auto"/>
+            </w:pPr>
+            <w:r>
+              <w:rPr>
+                <w:rFonts w:ascii="Arial" w:hAnsi="Arial" w:eastAsia="Arial" w:cs="Arial"/>
+                <w:b w:val="0"/>
+                <w:sz w:val="24"/>
+              </w:rPr>
+              <w:t>1.455</w:t>
+            </w:r>
+          </w:p>
+        </w:tc>
+        <w:tc>
+          <w:tcPr>
+            <w:tcW w:type="dxa" w:w="1460"/>
+            <w:tcBorders>
+              <w:top w:val="single" w:sz="4" w:color="D9D9D9"/>
+              <w:bottom w:val="single" w:sz="4" w:color="D9D9D9"/>
+              <w:left w:val="single" w:sz="4" w:color="D9D9D9"/>
+              <w:right w:val="single" w:sz="4" w:color="D9D9D9"/>
+            </w:tcBorders>
+            <w:tcMar>
+              <w:top w:w="60" w:type="dxa"/>
+              <w:bottom w:w="60" w:type="dxa"/>
+              <w:left w:w="60" w:type="dxa"/>
+              <w:right w:w="60" w:type="dxa"/>
+            </w:tcMar>
+          </w:tcPr>
+          <w:p>
+            <w:pPr>
+              <w:keepNext/>
+              <w:widowControl/>
+              <w:spacing w:after="60" w:before="40" w:line="250" w:lineRule="auto"/>
+            </w:pPr>
+            <w:r>
+              <w:rPr>
+                <w:rFonts w:ascii="Arial" w:hAnsi="Arial" w:eastAsia="Arial" w:cs="Arial"/>
+                <w:b w:val="0"/>
+                <w:sz w:val="24"/>
+              </w:rPr>
+              <w:t>1.476</w:t>
+            </w:r>
+          </w:p>
+        </w:tc>
+      </w:tr>
+      <w:tr>
+        <w:trPr>
+          <w:cantSplit/>
+        </w:trPr>
+        <w:tc>
+          <w:tcPr>
+            <w:tcW w:type="dxa" w:w="3699"/>
+            <w:tcBorders>
+              <w:top w:val="single" w:sz="4" w:color="D9D9D9"/>
+              <w:bottom w:val="single" w:sz="4" w:color="D9D9D9"/>
+              <w:left w:val="single" w:sz="4" w:color="D9D9D9"/>
+              <w:right w:val="single" w:sz="4" w:color="D9D9D9"/>
+            </w:tcBorders>
+            <w:tcMar>
+              <w:top w:w="60" w:type="dxa"/>
+              <w:bottom w:w="60" w:type="dxa"/>
+              <w:left w:w="60" w:type="dxa"/>
+              <w:right w:w="60" w:type="dxa"/>
+            </w:tcMar>
+          </w:tcPr>
+          <w:p>
+            <w:pPr>
+              <w:keepNext w:val="0"/>
+              <w:widowControl/>
+              <w:spacing w:after="60" w:before="40" w:line="250" w:lineRule="auto"/>
+            </w:pPr>
+            <w:r>
+              <w:rPr>
+                <w:rFonts w:ascii="Arial" w:hAnsi="Arial" w:eastAsia="Arial" w:cs="Arial"/>
+                <w:b w:val="0"/>
+                <w:sz w:val="24"/>
+              </w:rPr>
+              <w:t>100k / H64 / spread</w:t>
+            </w:r>
+          </w:p>
+        </w:tc>
+        <w:tc>
+          <w:tcPr>
+            <w:tcW w:type="dxa" w:w="1655"/>
+            <w:tcBorders>
+              <w:top w:val="single" w:sz="4" w:color="D9D9D9"/>
+              <w:bottom w:val="single" w:sz="4" w:color="D9D9D9"/>
+              <w:left w:val="single" w:sz="4" w:color="D9D9D9"/>
+              <w:right w:val="single" w:sz="4" w:color="D9D9D9"/>
+            </w:tcBorders>
+            <w:tcMar>
+              <w:top w:w="60" w:type="dxa"/>
+              <w:bottom w:w="60" w:type="dxa"/>
+              <w:left w:w="60" w:type="dxa"/>
+              <w:right w:w="60" w:type="dxa"/>
+            </w:tcMar>
+          </w:tcPr>
+          <w:p>
+            <w:pPr>
+              <w:keepNext w:val="0"/>
+              <w:widowControl/>
+              <w:spacing w:after="60" w:before="40" w:line="250" w:lineRule="auto"/>
+            </w:pPr>
+            <w:r>
+              <w:rPr>
+                <w:rFonts w:ascii="Arial" w:hAnsi="Arial" w:eastAsia="Arial" w:cs="Arial"/>
+                <w:b w:val="0"/>
+                <w:sz w:val="24"/>
+              </w:rPr>
+              <w:t>65,536</w:t>
+            </w:r>
+          </w:p>
+        </w:tc>
+        <w:tc>
+          <w:tcPr>
+            <w:tcW w:type="dxa" w:w="1460"/>
+            <w:tcBorders>
+              <w:top w:val="single" w:sz="4" w:color="D9D9D9"/>
+              <w:bottom w:val="single" w:sz="4" w:color="D9D9D9"/>
+              <w:left w:val="single" w:sz="4" w:color="D9D9D9"/>
+              <w:right w:val="single" w:sz="4" w:color="D9D9D9"/>
+            </w:tcBorders>
+            <w:tcMar>
+              <w:top w:w="60" w:type="dxa"/>
+              <w:bottom w:w="60" w:type="dxa"/>
+              <w:left w:w="60" w:type="dxa"/>
+              <w:right w:w="60" w:type="dxa"/>
+            </w:tcMar>
+          </w:tcPr>
+          <w:p>
+            <w:pPr>
+              <w:keepNext w:val="0"/>
+              <w:widowControl/>
+              <w:spacing w:after="60" w:before="40" w:line="250" w:lineRule="auto"/>
+            </w:pPr>
+            <w:r>
+              <w:rPr>
+                <w:rFonts w:ascii="Arial" w:hAnsi="Arial" w:eastAsia="Arial" w:cs="Arial"/>
+                <w:b w:val="0"/>
+                <w:sz w:val="24"/>
+              </w:rPr>
+              <w:t>0.777</w:t>
+            </w:r>
+          </w:p>
+        </w:tc>
+        <w:tc>
+          <w:tcPr>
+            <w:tcW w:type="dxa" w:w="1460"/>
+            <w:tcBorders>
+              <w:top w:val="single" w:sz="4" w:color="D9D9D9"/>
+              <w:bottom w:val="single" w:sz="4" w:color="D9D9D9"/>
+              <w:left w:val="single" w:sz="4" w:color="D9D9D9"/>
+              <w:right w:val="single" w:sz="4" w:color="D9D9D9"/>
+            </w:tcBorders>
+            <w:tcMar>
+              <w:top w:w="60" w:type="dxa"/>
+              <w:bottom w:w="60" w:type="dxa"/>
+              <w:left w:w="60" w:type="dxa"/>
+              <w:right w:w="60" w:type="dxa"/>
+            </w:tcMar>
+          </w:tcPr>
+          <w:p>
+            <w:pPr>
+              <w:keepNext w:val="0"/>
+              <w:widowControl/>
+              <w:spacing w:after="60" w:before="40" w:line="250" w:lineRule="auto"/>
+            </w:pPr>
+            <w:r>
+              <w:rPr>
+                <w:rFonts w:ascii="Arial" w:hAnsi="Arial" w:eastAsia="Arial" w:cs="Arial"/>
+                <w:b w:val="0"/>
+                <w:sz w:val="24"/>
+              </w:rPr>
+              <w:t>0.744</w:t>
+            </w:r>
+          </w:p>
+        </w:tc>
+        <w:tc>
+          <w:tcPr>
+            <w:tcW w:type="dxa" w:w="1460"/>
+            <w:tcBorders>
+              <w:top w:val="single" w:sz="4" w:color="D9D9D9"/>
+              <w:bottom w:val="single" w:sz="4" w:color="D9D9D9"/>
+              <w:left w:val="single" w:sz="4" w:color="D9D9D9"/>
+              <w:right w:val="single" w:sz="4" w:color="D9D9D9"/>
+            </w:tcBorders>
+            <w:tcMar>
+              <w:top w:w="60" w:type="dxa"/>
+              <w:bottom w:w="60" w:type="dxa"/>
+              <w:left w:w="60" w:type="dxa"/>
+              <w:right w:w="60" w:type="dxa"/>
+            </w:tcMar>
+          </w:tcPr>
+          <w:p>
+            <w:pPr>
+              <w:keepNext w:val="0"/>
+              <w:widowControl/>
+              <w:spacing w:after="60" w:before="40" w:line="250" w:lineRule="auto"/>
+            </w:pPr>
+            <w:r>
+              <w:rPr>
+                <w:rFonts w:ascii="Arial" w:hAnsi="Arial" w:eastAsia="Arial" w:cs="Arial"/>
+                <w:b w:val="0"/>
+                <w:sz w:val="24"/>
+              </w:rPr>
+              <w:t>0.850</w:t>
+            </w:r>
+          </w:p>
+        </w:tc>
+      </w:tr>
+    </w:tbl>
+    <w:p>
+      <w:pPr>
+        <w:widowControl/>
+        <w:jc w:val="both"/>
+      </w:pPr>
+      <w:r>
+        <w:t>All three seeds favour log at 32,768 repeated-key operations and Merkle at 65,536 and 131,072. The earlier single-seed diagnostic's opposite preferences at 32,768 and 65,536 are not reproduced; those original measurements remain reported separately. At 65,536 operations, all three spread histories favour log instead. Reopened measurements retain the profile contrast for all three seeds: log/Merkle median ratios are 1.198-1.410 for repeated-key and 0.709-0.734 for spread. These profiles differ in row count and history length as well as locality, so the contrast does not isolate a causal locality effect or establish an exact crossover.</w:t>
+      </w:r>
+    </w:p>
+    <w:p>
+      <w:pPr>
+        <w:widowControl/>
+        <w:jc w:val="both"/>
+      </w:pPr>
+      <w:r>
+        <w:t>Relative to T=16,384, T=131,072 lowers warmed spread median latency by 13.1-22.2%, but raises repeated-key latency by 12.3-19.7% at 65,536 and 36.0-53.5% at 131,072 operations. These ranges describe three seed-specific differences, not confidence intervals. Same-path selector/forced median ratios across retained conditions range from 0.614 to 1.213, exposing substantial timing variability. Small differences among thresholds selecting the same algorithm cannot therefore be treated as algorithmic gains. Neither always-log nor simply increasing T is consistently best across these profiles. No new threshold is selected and no production default is changed.</w:t>
+      </w:r>
+    </w:p>
+    <w:p>
+      <w:pPr>
         <w:pStyle w:val="Heading1"/>
         <w:widowControl/>
       </w:pPr>
@@ -16612,6 +17640,15 @@
       </w:pPr>
       <w:r>
         <w:t>For RQ2, adaptive differencing helps selected sparse and repeated-key workloads without changing their version semantics. M/H footprints are nearly equal because the representations are shared. Dense and long histories do not consistently favour H. The new threshold supplement shows that 4,096 is a conservative frozen rule for earlier results, not a measured universal crossover; 16,384 is the best sampled candidate in a distinct cached-query protocol.</w:t>
+      </w:r>
+    </w:p>
+    <w:p>
+      <w:pPr>
+        <w:widowControl/>
+        <w:jc w:val="both"/>
+      </w:pPr>
+      <w:r>
+        <w:t>The separate pilot strengthens the case for investigating workload-sensitive selection: one operation count corresponds to different preferred paths across the retained profiles. It also shows why a larger threshold alone is insufficient. The single-seed reversal does not repeat under the new histories, but three histories and confounded profiles cannot resolve its cause or validate a replacement selector. The frozen 16,384 candidate choice and original 4,096 workflow settings remain unchanged.</w:t>
       </w:r>
     </w:p>
     <w:p>
@@ -16692,6 +17729,15 @@
         <w:jc w:val="both"/>
       </w:pPr>
       <w:r>
+        <w:t>Pilot scope: only three independent histories per retained condition are measured. Six planned spread cases are omitted by the predeclared resource rule. Row count, history length and locality vary together; background resource conditions are not controlled. Fresh-process hash seeds differ from warmed seeds, and eager reopen plus an uncleared OS cache is not cold storage. Large same-path timing variation prevents causal claims about selector overhead or small candidate differences. The pilot is exploratory and supplies no new calibration/held-out selection or independent Linux replication.</w:t>
+      </w:r>
+    </w:p>
+    <w:p>
+      <w:pPr>
+        <w:widowControl/>
+        <w:jc w:val="both"/>
+      </w:pPr>
+      <w:r>
         <w:t>Memory: We measured median whole-worker process-tree RSS in eight primary scenarios for Snapshot, Log-only, Revon-M, Revon-H, and SQL-path Dolt. These measurements include shared workload/oracle state and adapter processes, so they are not product-only memory figures. The parent process sampled every 10 ms outside timed operations. It may miss shorter peaks, and monitoring may add small scheduling pressure. Dolt bulk-import measurements are reported separately from SQL-path Dolt. Public-data trials also include workload/oracle memory. The host had limited available RAM at launch; memory pressure and paging costs were not isolated from the workflow, so the measured scaling should not be read as an algorithm-only complexity result.</w:t>
       </w:r>
     </w:p>
@@ -16746,6 +17792,15 @@
         <w:jc w:val="both"/>
       </w:pPr>
       <w:r>
+        <w:t>A focused follow-up should hold row count and history length constant while varying locality and update density, fix Python hash seeds across process conditions, and record GC and resource behaviour. Independent histories should be the uncertainty unit. More seeds, fresh calibration and untouched validation workloads are needed before adopting a richer selector; the present pilot does not justify changing T.</w:t>
+      </w:r>
+    </w:p>
+    <w:p>
+      <w:pPr>
+        <w:widowControl/>
+        <w:jc w:val="both"/>
+      </w:pPr>
+      <w:r>
         <w:t>Revon’s storage could be reduced through binary node records, separate value chunks, packed objects, compression, reachability checks, and garbage collection. An ordered Merkle index or content-defined chunking could add range scans and history-independent boundaries while retaining the fixed trie as a controlled baseline.</w:t>
       </w:r>
     </w:p>
@@ -16773,7 +17828,7 @@
         <w:jc w:val="both"/>
       </w:pPr>
       <w:r>
-        <w:t>Revon combines immutable objects, incremental trie updates, SQLite persistence, historical checkout and adaptive log/Merkle differencing. A prominent same-representation ablation supports advantages for selected sparse and repeated-key intervals, with dense and long-history qualifications retained. Public records reach one million rows using generated corrections and expose substantial commit and storage costs. New calibration and held-out measurements improve threshold evidence without rewriting earlier results or establishing a universal optimum. The contribution is a reproducible comparison of diff choices in a single-writer prototype; independent hardware validation remains uncompleted.</w:t>
+        <w:t>Revon combines immutable objects, incremental trie updates, SQLite persistence, historical checkout and adaptive log/Merkle differencing. A prominent same-representation ablation supports advantages for selected sparse and repeated-key intervals, with dense and long-history qualifications retained. Public records reach one million rows using generated corrections and expose substantial commit and storage costs. New calibration and held-out measurements improve threshold evidence without rewriting earlier results or establishing a universal optimum. A separate three-seed pilot finds profile-dependent path preferences and opposing effects from increasing the threshold, without validating a new optimum. The contribution is a reproducible comparison of diff choices in a single-writer prototype; independent hardware validation remains uncompleted.</w:t>
       </w:r>
     </w:p>
     <w:p>
@@ -16791,7 +17846,7 @@
         <w:jc w:val="both"/>
       </w:pPr>
       <w:r>
-        <w:t>The primary synthetic evidence is evidence/paper-corrected-issues13-17-counterbalanced-final-20260923, with paired_ratio_uncertainty.csv. Separate robustness, WSL and telemetry bundles are evidence/paper-issues18-20-robustness-20260923, evidence/paper-issues18-20-linux-wsl-20260923 and evidence/paper-issues14-windows-telemetry-20260924. Trie sensitivity is evidence/trie-sensitivity-issues8-20260923. Public TLC analysis is evidence/public-tlc-combined-20261002, referring to its original execution and isolated recovery parents. Pilots are excluded. Local revision evidence is not yet a public release.</w:t>
+        <w:t>The primary synthetic evidence is evidence/paper-corrected-issues13-17-counterbalanced-final-20260923, with paired_ratio_uncertainty.csv. Separate robustness, WSL and telemetry bundles are evidence/paper-issues18-20-robustness-20260923, evidence/paper-issues18-20-linux-wsl-20260923 and evidence/paper-issues14-windows-telemetry-20260924. Trie sensitivity is evidence/trie-sensitivity-issues8-20260923. Public TLC analysis is evidence/public-tlc-combined-20261002, referring to its original execution and isolated recovery parents. TLC preparation pilots are excluded. Local revision evidence is not yet a public release.</w:t>
       </w:r>
     </w:p>
     <w:p>
@@ -16801,6 +17856,15 @@
       </w:pPr>
       <w:r>
         <w:t>New held-out threshold evidence is evidence/threshold-heldout-20261002. Reproduce with Python 3.14: python -m experiments.threshold_validation --output &lt;new-directory&gt;. The diagnostic extension is evidence/crossover-diagnostic-20261002, reproduced with python -m experiments.crossover_extension --output &lt;new-directory&gt;. Each bundle archives exact source files and hashes, workloads, raw query records, selection, summaries and correctness checks. The pilot at evidence/threshold-pilot-20261002 is excluded. Working databases are reproducible and removed after verified reopen checks; payload accounting and integrity counts are retained.</w:t>
+      </w:r>
+    </w:p>
+    <w:p>
+      <w:pPr>
+        <w:widowControl/>
+        <w:jc w:val="both"/>
+      </w:pPr>
+      <w:r>
+        <w:t>The separate robustness pilot is evidence/threshold-robustness-pilot-20261002. It retains the frozen manifest and source hashes, raw timings, seed-specific ratios, resource exclusions and semantic checks. It is not the earlier excluded threshold-pilot bundle. Reproduction commands and process/cache qualifications are in docs/experiments/THRESHOLD_ROBUSTNESS_PILOT.md. Public release of this new bundle is pending; it is reported only as exploratory evidence, separate from original and held-out results.</w:t>
       </w:r>
     </w:p>
     <w:p>

</xml_diff>